<commit_message>
feat(resume): update resume files and enhance layout components
- Added new resume file `wilsonchow_resume_v4_full-stack.pdf` and updated existing resume files.
- Removed outdated `resume_archived.pdf` and `wilsonchow_resume.docx`.
- Integrated `nextjs-toploader` for improved loading experience in layout components.
- Refactored `FeaturedDesigns` and `ListNotesItems` components to utilize `ChevronBadge` for better UI consistency.
- Enhanced layout transition properties in `PageLayout` for smoother animations.
- Updated resume content to reflect recent experiences and skills, including a focus on Node.js and mentoring.
</commit_message>
<xml_diff>
--- a/apps/web/src/features/resume/wilsonchow_resume_v3_ai.docx
+++ b/apps/web/src/features/resume/wilsonchow_resume_v3_ai.docx
@@ -75,7 +75,7 @@
           <w:color w:val="1A1A1A"/>
           <w:sz w:val="21"/>
         </w:rPr>
-        <w:t xml:space="preserve">Software engineer focused on production AI systems. Five years shipping full-stack products; currently leading a multi-channel agent platform with durable workflows, memory, RAG, scorers, and evals. Builds the typed APIs and UIs those agents run through — not a chat-completion wrapper. AWS Solutions Architect Associate.</w:t>
+        <w:t xml:space="preserve">Software engineer focused on production AI systems. Five years shipping full-stack Node.js products; currently leading a multi-channel agent platform with durable workflows, memory, RAG, scorers, and evals. Builds the typed APIs and UIs those agents run through — not a chat-completion wrapper. AWS Solutions Architect Associate.</w:t>
       </w:r>
     </w:p>
     <w:p>
@@ -195,7 +195,7 @@
           <w:color w:val="1A1A1A"/>
           <w:sz w:val="21"/>
         </w:rPr>
-        <w:t xml:space="preserve">Built typed APIs with Hono, Drizzle, OpenAPI, and tRPC on AWS Lambda / API Gateway, backed by Postgres / DynamoDB / S3.</w:t>
+        <w:t xml:space="preserve">Built typed Node.js APIs with Hono, Drizzle / Prisma, OpenAPI, and tRPC on AWS Lambda / API Gateway, backed by Postgres / DynamoDB / S3.</w:t>
       </w:r>
     </w:p>
     <w:p>
@@ -298,6 +298,22 @@
           <w:sz w:val="21"/>
         </w:rPr>
         <w:t xml:space="preserve"> production web and mobile apps; the agent platform is the current system, not a side demo.</w:t>
+      </w:r>
+    </w:p>
+    <w:p>
+      <w:pPr>
+        <w:pStyle w:val="ListBullet"/>
+        <w:spacing w:after="30" w:before="0"/>
+        <w:ind w:left="288"/>
+      </w:pPr>
+      <w:r>
+        <w:rPr>
+          <w:rFonts w:ascii="Calibri" w:hAnsi="Calibri" w:eastAsia="Calibri"/>
+          <w:b w:val="0"/>
+          <w:color w:val="1A1A1A"/>
+          <w:sz w:val="21"/>
+        </w:rPr>
+        <w:t xml:space="preserve">Mentored summer interns and junior developers through pairing, code reviews, and shipping production work.</w:t>
       </w:r>
     </w:p>
     <w:p>
@@ -661,7 +677,7 @@
           <w:color w:val="1A1A1A"/>
           <w:sz w:val="21"/>
         </w:rPr>
-        <w:t xml:space="preserve">TypeScript, Python</w:t>
+        <w:t xml:space="preserve">TypeScript, Node.js, Python</w:t>
       </w:r>
     </w:p>
     <w:p>
@@ -707,7 +723,7 @@
           <w:color w:val="1A1A1A"/>
           <w:sz w:val="21"/>
         </w:rPr>
-        <w:t xml:space="preserve">Hono, Drizzle, OpenAPI, tRPC, Postgres, DynamoDB, S3, Better Auth</w:t>
+        <w:t xml:space="preserve">Hono, Drizzle, Prisma, OpenAPI, tRPC, Postgres, DynamoDB, S3, Better Auth</w:t>
       </w:r>
     </w:p>
     <w:p>
@@ -878,23 +894,7 @@
           <w:color w:val="1A1A1A"/>
           <w:sz w:val="21"/>
         </w:rPr>
-        <w:t xml:space="preserve">Registered Pharmacist, GPhC, 2021 – Present</w:t>
-      </w:r>
-    </w:p>
-    <w:p>
-      <w:pPr>
-        <w:pStyle w:val="ListBullet"/>
-        <w:spacing w:after="30" w:before="0"/>
-        <w:ind w:left="288"/>
-      </w:pPr>
-      <w:r>
-        <w:rPr>
-          <w:rFonts w:ascii="Calibri" w:hAnsi="Calibri" w:eastAsia="Calibri"/>
-          <w:b w:val="0"/>
-          <w:color w:val="1A1A1A"/>
-          <w:sz w:val="21"/>
-        </w:rPr>
-        <w:t xml:space="preserve">Career switch from pharmacy; trained in rigorous, detail-heavy problem spaces — useful for eval design and failure cases</w:t>
+        <w:t xml:space="preserve">Career switch from pharmacy after finding a passion for building apps and systems; used to high-stakes, detail-heavy failure cases — useful for eval design</w:t>
       </w:r>
     </w:p>
     <w:sectPr>

</xml_diff>

<commit_message>
feat(resume): update resume files and enhance content
- Updated existing resume files and added a new document `~$lsonchow_resume_v3_full-stack.docx`.
- Revised content in `resume-v3-ai.mdx`, `resume-v3-frontend.mdx`, and `resume-v3-full-stack.mdx` to reflect recent experiences and skills, emphasizing Generative AI and multi-client environments.
- Improved layout and clarity in resume descriptions, highlighting achievements and technical proficiencies.
</commit_message>
<xml_diff>
--- a/apps/web/src/features/resume/wilsonchow_resume_v3_ai.docx
+++ b/apps/web/src/features/resume/wilsonchow_resume_v3_ai.docx
@@ -75,7 +75,7 @@
           <w:color w:val="1A1A1A"/>
           <w:sz w:val="21"/>
         </w:rPr>
-        <w:t xml:space="preserve">Software engineer focused on production AI systems. Five years shipping full-stack Node.js products; currently leading a multi-channel agent platform with durable workflows, memory, RAG, scorers, and evals. Builds the typed APIs and UIs those agents run through — not a chat-completion wrapper. AWS Solutions Architect Associate.</w:t>
+        <w:t xml:space="preserve">Software engineer with 5 years delivering medium-to-large full-stack Node.js initiatives in a fast-paced, multi-client environment. Currently leading a multi-channel Generative AI agent platform with durable workflows, memory, RAG, scorers, and evals. Builds the typed APIs and UIs those agents run through — not a chat-completion wrapper. AWS Solutions Architect Associate.</w:t>
       </w:r>
     </w:p>
     <w:p>
@@ -147,7 +147,7 @@
           <w:color w:val="4A4A4A"/>
           <w:sz w:val="20"/>
         </w:rPr>
-        <w:t xml:space="preserve">Primary engineer for concurrent client products. Recent work is production agents — workflows, memory, tools, and quality gates — on top of typed APIs and AWS.</w:t>
+        <w:t xml:space="preserve">Primary engineer for concurrent client products, partnering with technical and non-technical stakeholders. Recent work is production Generative AI agents — workflows, memory, tools, and quality gates — on top of typed APIs and AWS.</w:t>
       </w:r>
     </w:p>
     <w:p>
@@ -195,7 +195,7 @@
           <w:color w:val="1A1A1A"/>
           <w:sz w:val="21"/>
         </w:rPr>
-        <w:t xml:space="preserve">Built typed Node.js APIs with Hono, Drizzle / Prisma, OpenAPI, and tRPC on AWS Lambda / API Gateway, backed by Postgres / DynamoDB / S3.</w:t>
+        <w:t xml:space="preserve">Built typed Node.js APIs with Hono, Drizzle / Prisma, OpenAPI, and tRPC in a Turborepo, deployed with SST. Dockerized APIs on ECS Fargate; other workloads on Lambda / API Gateway. Familiar with Kubernetes from AWS Solutions Architect study; production containers are Docker on ECS, not self-managed K8s.</w:t>
       </w:r>
     </w:p>
     <w:p>
@@ -297,7 +297,7 @@
           <w:color w:val="1A1A1A"/>
           <w:sz w:val="21"/>
         </w:rPr>
-        <w:t xml:space="preserve"> production web and mobile apps; the agent platform is the current system, not a side demo.</w:t>
+        <w:t xml:space="preserve"> production web and mobile apps as medium-to-large initiatives; the agent platform is the current system, not a side demo.</w:t>
       </w:r>
     </w:p>
     <w:p>
@@ -419,7 +419,7 @@
           <w:color w:val="1A1A1A"/>
           <w:sz w:val="21"/>
         </w:rPr>
-        <w:t xml:space="preserve">Shipped end-to-end RAG: ingest/parse, chunking, Pinecone retrieval with query/rerank (graph query where needed).</w:t>
+        <w:t xml:space="preserve">Shipped end-to-end RAG: ingest/parse, chunking, Pinecone retrieval with query/rerank (graph query where needed). Retrieval is org-scoped (namespace = organization) so the model cannot search another tenant.</w:t>
       </w:r>
     </w:p>
     <w:p>
@@ -435,7 +435,7 @@
           <w:color w:val="1A1A1A"/>
           <w:sz w:val="21"/>
         </w:rPr>
-        <w:t xml:space="preserve">Added ClickHouse run/tool traces and cost/latency metrics; gated releases on scored evals after prompt or tool changes.</w:t>
+        <w:t xml:space="preserve">Added ClickHouse run/tool traces and cost/latency metrics; gated releases on scored evals after prompt or tool changes — diagnosing issues across UI, API, and agent runs.</w:t>
       </w:r>
     </w:p>
     <w:p>
@@ -451,7 +451,7 @@
           <w:color w:val="1A1A1A"/>
           <w:sz w:val="21"/>
         </w:rPr>
-        <w:t xml:space="preserve">Ran Hono + Better Auth on ECS, Postgres for core data, S3 for files — so agent state and artifacts outlive a single request.</w:t>
+        <w:t xml:space="preserve">Ran Dockerized Hono + Better Auth on ECS Fargate, Postgres for core data, S3 for files — so agent state and artifacts outlive a single request.</w:t>
       </w:r>
     </w:p>
     <w:p>
@@ -700,7 +700,7 @@
           <w:color w:val="1A1A1A"/>
           <w:sz w:val="21"/>
         </w:rPr>
-        <w:t xml:space="preserve">Mastra, Vercel AI SDK, Langchain, Pinecone, evals (golden prompts, LLM-as-judge), ClickHouse traces</w:t>
+        <w:t xml:space="preserve">Mastra, Vercel AI SDK, Langchain, Pinecone, Strands, AWS Bedrock, evals (golden prompts, LLM-as-judge), ClickHouse traces</w:t>
       </w:r>
     </w:p>
     <w:p>
@@ -723,7 +723,7 @@
           <w:color w:val="1A1A1A"/>
           <w:sz w:val="21"/>
         </w:rPr>
-        <w:t xml:space="preserve">Hono, Drizzle, Prisma, OpenAPI, tRPC, Postgres, DynamoDB, S3, Better Auth</w:t>
+        <w:t xml:space="preserve">Hono, Drizzle, Prisma, OpenAPI, tRPC, Postgres, DynamoDB, S3, Better Auth, Multitenancy</w:t>
       </w:r>
     </w:p>
     <w:p>
@@ -769,7 +769,7 @@
           <w:color w:val="1A1A1A"/>
           <w:sz w:val="21"/>
         </w:rPr>
-        <w:t xml:space="preserve">SST, Docker, AWS (Lambda, API Gateway, ECS), GitHub Actions</w:t>
+        <w:t xml:space="preserve">SST, Docker, ECS Fargate, GitHub Actions, AWS (Lambda, API Gateway) · Kubernetes (familiar)</w:t>
       </w:r>
     </w:p>
     <w:p>
@@ -894,7 +894,7 @@
           <w:color w:val="1A1A1A"/>
           <w:sz w:val="21"/>
         </w:rPr>
-        <w:t xml:space="preserve">Career switch from pharmacy after finding a passion for building apps and systems; used to high-stakes, detail-heavy failure cases — useful for eval design</w:t>
+        <w:t xml:space="preserve">Career switch from pharmacy — a regulated, high-stakes domain — after finding a passion for building apps and systems</w:t>
       </w:r>
     </w:p>
     <w:sectPr>

</xml_diff>